<commit_message>
Popraw niespójności w klauzuli RODO (IOD, definicje, źródło danych)
Co-Authored-By: Claude Sonnet 5.5 <noreply@anthropic.com>
Claude-Session: https://claude.ai/code/session_019GC9aK6s8md7WkZ87QpYCa
</commit_message>
<xml_diff>
--- a/Megalog_informacja_RODO_14.10.2026.docx
+++ b/Megalog_informacja_RODO_14.10.2026.docx
@@ -152,7 +152,7 @@
             <w:sz w:val="22"/>
             <w:szCs w:val="22"/>
           </w:rPr>
-          <w:t xml:space="preserve">Niniejsza informacja jest kierowana do osób fizycznych, które reprezentują strony Umowy nr 393/2026/Wn7/OA-IN-FM/D o dofinansowanie realizacji inwestycji ze środków NFOŚiGW zgromadzonych na rachunku Funduszu Modernizacyjnego w formie dotacji (dalej: Umowa) lub działają w ich imieniu, w szczególności reprezentantów, pełnomocników, pracowników i współpracowników Narodowego Funduszu Ochrony Środowiska i Gospodarki Wodnej – Krajowego Operatora Funduszu Modernizacyjnego (dalej: NFOŚiGW) oraz Spółki, wskazanych do wykonywania Umowy. Informację przekazujemy zgodnie z art. 13 i 14 RODO oraz § 18 Umowy.</w:t>
+          <w:t xml:space="preserve">Niniejsza informacja jest kierowana do osób fizycznych, które reprezentują strony Umowy nr 393/2026/Wn7/OA-IN-FM/D o dofinansowanie realizacji inwestycji w formie dotacji ze środków zgromadzonych na rachunku Funduszu Modernizacyjnego (dalej: Umowa) lub działają w ich imieniu, w szczególności reprezentantów, pełnomocników, pracowników i współpracowników Narodowego Funduszu Ochrony Środowiska i Gospodarki Wodnej – Krajowego Operatora Funduszu Modernizacyjnego (dalej: NFOŚiGW) oraz Spółki, wskazanych do wykonywania Umowy. Informację przekazujemy zgodnie z art. 13 i 14 RODO oraz § 18 Umowy.</w:t>
         </w:r>
       </w:ins>
       <w:commentRangeEnd w:id="1"/>
@@ -399,7 +399,7 @@
             <w:sz w:val="22"/>
             <w:szCs w:val="22"/>
           </w:rPr>
-          <w:t xml:space="preserve">Administrator nie wyznaczył inspektora ochrony danych. W sprawach dotyczących przetwarzania danych osobowych i wykonywania przysługujących praw można kontaktować się z Administratorem pod adresem e-mail: info@megalog.pl.</w:t>
+          <w:t xml:space="preserve">Administrator nie wyznaczył inspektora ochrony danych.</w:t>
         </w:r>
       </w:ins>
       <w:commentRangeEnd w:id="2"/>
@@ -629,7 +629,7 @@
             <w:sz w:val="22"/>
             <w:szCs w:val="22"/>
           </w:rPr>
-          <w:t xml:space="preserve">Przetwarzamy następujące kategorie Państwa danych osobowych: imię i nazwisko, stanowisko lub pełniona funkcja, służbowe dane kontaktowe (adres e-mail, numer telefonu), podpis lub kwalifikowany podpis elektroniczny oraz dane dotyczące umocowania do działania w imieniu strony Umowy. Dane pochodzą od NFOŚiGW (w odniesieniu do jego reprezentantów, pracowników i współpracowników), bezpośrednio od Państwa lub od Spółki (w odniesieniu do jej reprezentantów, pracowników i współpracowników) oraz z publicznie dostępnych rejestrów (w szczególności Krajowego Rejestru Sądowego).</w:t>
+          <w:t xml:space="preserve">Przetwarzamy następujące kategorie Państwa danych osobowych: imię i nazwisko, stanowisko lub pełniona funkcja, służbowe dane kontaktowe (adres e-mail, numer telefonu), podpis lub kwalifikowany podpis elektroniczny oraz dane dotyczące umocowania do działania w imieniu strony Umowy. Dane pochodzą od NFOŚiGW (w odniesieniu do jego reprezentantów, pracowników i współpracowników), bezpośrednio od Państwa (w odniesieniu do reprezentantów, pracowników i współpracowników Spółki) oraz z publicznie dostępnych rejestrów (w szczególności Krajowego Rejestru Sądowego).</w:t>
         </w:r>
       </w:ins>
       <w:commentRangeEnd w:id="4"/>

</xml_diff>